<commit_message>
components and icons modified
</commit_message>
<xml_diff>
--- a/public/resume.docx
+++ b/public/resume.docx
@@ -415,6 +415,14 @@
               <w:t>WORDPRESS</w:t>
             </w:r>
           </w:p>
+          <w:p>
+            <w:pPr>
+              <w:pStyle w:val="ListBullet"/>
+            </w:pPr>
+            <w:r>
+              <w:t>PHOTOSHOP</w:t>
+            </w:r>
+          </w:p>
         </w:tc>
         <w:tc>
           <w:tcPr>
@@ -566,13 +574,14 @@
               <w:t xml:space="preserve">Integrated third-party payment gateways like </w:t>
             </w:r>
             <w:r>
-              <w:t xml:space="preserve">Stripe, PayPal, </w:t>
-            </w:r>
-            <w:proofErr w:type="spellStart"/>
-            <w:r>
-              <w:t>Razorpay</w:t>
-            </w:r>
-            <w:proofErr w:type="spellEnd"/>
+              <w:t>Stripe, PayPal, Razor</w:t>
+            </w:r>
+            <w:r>
+              <w:t>P</w:t>
+            </w:r>
+            <w:r>
+              <w:t>ay</w:t>
+            </w:r>
             <w:r>
               <w:t xml:space="preserve"> for seamless transactions. </w:t>
             </w:r>
@@ -586,21 +595,14 @@
               </w:numPr>
             </w:pPr>
             <w:r>
-              <w:t xml:space="preserve">Worked with page builders like </w:t>
-            </w:r>
-            <w:proofErr w:type="spellStart"/>
-            <w:r>
-              <w:t>Elementor</w:t>
-            </w:r>
-            <w:proofErr w:type="spellEnd"/>
-            <w:r>
-              <w:t xml:space="preserve">, </w:t>
-            </w:r>
-            <w:proofErr w:type="spellStart"/>
-            <w:r>
-              <w:t>WPBakery</w:t>
-            </w:r>
-            <w:proofErr w:type="spellEnd"/>
+              <w:t>Worked with page builders like</w:t>
+            </w:r>
+            <w:r>
+              <w:t>:</w:t>
+            </w:r>
+            <w:r>
+              <w:t xml:space="preserve"> Elementor, WPBakery</w:t>
+            </w:r>
             <w:r>
               <w:t>.</w:t>
             </w:r>
@@ -958,25 +960,13 @@
               <w:pStyle w:val="Heading2"/>
             </w:pPr>
             <w:r>
-              <w:t xml:space="preserve">react js </w:t>
-            </w:r>
-            <w:r>
-              <w:t>INTERN</w:t>
-            </w:r>
-            <w:r>
-              <w:t xml:space="preserve"> </w:t>
+              <w:t xml:space="preserve">react js INTERN </w:t>
             </w:r>
             <w:r>
               <w:rPr>
                 <w:rStyle w:val="NotBold"/>
               </w:rPr>
-              <w:t>-</w:t>
-            </w:r>
-            <w:r>
-              <w:rPr>
-                <w:rStyle w:val="NotBold"/>
-              </w:rPr>
-              <w:t>THINKNEXT TECHNOLOGY</w:t>
+              <w:t>-THINKNEXT TECHNOLOGY</w:t>
             </w:r>
             <w:r>
               <w:rPr>
@@ -996,10 +986,7 @@
               <w:t>20</w:t>
             </w:r>
             <w:r>
-              <w:t>2</w:t>
-            </w:r>
-            <w:r>
-              <w:t>3</w:t>
+              <w:t>23</w:t>
             </w:r>
             <w:r>
               <w:t xml:space="preserve"> - </w:t>
@@ -1011,10 +998,7 @@
               <w:t xml:space="preserve"> 20</w:t>
             </w:r>
             <w:r>
-              <w:t>2</w:t>
-            </w:r>
-            <w:r>
-              <w:t>3</w:t>
+              <w:t>23</w:t>
             </w:r>
           </w:p>
           <w:p>
@@ -1128,145 +1112,37 @@
 <file path=word/numbering.xml><?xml version="1.0" encoding="utf-8"?>
 <w:numbering xmlns:wpc="http://schemas.microsoft.com/office/word/2010/wordprocessingCanvas" xmlns:cx="http://schemas.microsoft.com/office/drawing/2014/chartex" xmlns:cx1="http://schemas.microsoft.com/office/drawing/2015/9/8/chartex" xmlns:cx2="http://schemas.microsoft.com/office/drawing/2015/10/21/chartex" xmlns:cx3="http://schemas.microsoft.com/office/drawing/2016/5/9/chartex" xmlns:cx4="http://schemas.microsoft.com/office/drawing/2016/5/10/chartex" xmlns:cx5="http://schemas.microsoft.com/office/drawing/2016/5/11/chartex" xmlns:cx6="http://schemas.microsoft.com/office/drawing/2016/5/12/chartex" xmlns:cx7="http://schemas.microsoft.com/office/drawing/2016/5/13/chartex" xmlns:cx8="http://schemas.microsoft.com/office/drawing/2016/5/14/chartex" xmlns:mc="http://schemas.openxmlformats.org/markup-compatibility/2006" xmlns:aink="http://schemas.microsoft.com/office/drawing/2016/ink" xmlns:am3d="http://schemas.microsoft.com/office/drawing/2017/model3d" xmlns:o="urn:schemas-microsoft-com:office:office" xmlns:oel="http://schemas.microsoft.com/office/2019/extlst" xmlns:r="http://schemas.openxmlformats.org/officeDocument/2006/relationships" xmlns:m="http://schemas.openxmlformats.org/officeDocument/2006/math" xmlns:v="urn:schemas-microsoft-com:vml" xmlns:wp14="http://schemas.microsoft.com/office/word/2010/wordprocessingDrawing" xmlns:wp="http://schemas.openxmlformats.org/drawingml/2006/wordprocessingDrawing" xmlns:w10="urn:schemas-microsoft-com:office:word" xmlns:w="http://schemas.openxmlformats.org/wordprocessingml/2006/main" xmlns:w14="http://schemas.microsoft.com/office/word/2010/wordml" xmlns:w15="http://schemas.microsoft.com/office/word/2012/wordml" xmlns:w16cex="http://schemas.microsoft.com/office/word/2018/wordml/cex" xmlns:w16cid="http://schemas.microsoft.com/office/word/2016/wordml/cid" xmlns:w16="http://schemas.microsoft.com/office/word/2018/wordml" xmlns:w16du="http://schemas.microsoft.com/office/word/2023/wordml/word16du" xmlns:w16sdtdh="http://schemas.microsoft.com/office/word/2020/wordml/sdtdatahash" xmlns:w16sdtfl="http://schemas.microsoft.com/office/word/2024/wordml/sdtformatlock" xmlns:w16se="http://schemas.microsoft.com/office/word/2015/wordml/symex" xmlns:wpg="http://schemas.microsoft.com/office/word/2010/wordprocessingGroup" xmlns:wpi="http://schemas.microsoft.com/office/word/2010/wordprocessingInk" xmlns:wne="http://schemas.microsoft.com/office/word/2006/wordml" xmlns:wps="http://schemas.microsoft.com/office/word/2010/wordprocessingShape" mc:Ignorable="w14 w15 w16se w16cid w16 w16cex w16sdtdh w16sdtfl w16du wp14">
   <w:numPicBullet w:numPicBulletId="0">
-    <mc:AlternateContent>
-      <mc:Choice Requires="v">
-        <w:pict>
-          <v:shapetype w14:anchorId="69B76AD3" id="_x0000_t75" coordsize="21600,21600" o:spt="75" o:preferrelative="t" path="m@4@5l@4@11@9@11@9@5xe" filled="f" stroked="f">
-            <v:stroke joinstyle="miter"/>
-            <v:formulas>
-              <v:f eqn="if lineDrawn pixelLineWidth 0"/>
-              <v:f eqn="sum @0 1 0"/>
-              <v:f eqn="sum 0 0 @1"/>
-              <v:f eqn="prod @2 1 2"/>
-              <v:f eqn="prod @3 21600 pixelWidth"/>
-              <v:f eqn="prod @3 21600 pixelHeight"/>
-              <v:f eqn="sum @0 0 1"/>
-              <v:f eqn="prod @6 1 2"/>
-              <v:f eqn="prod @7 21600 pixelWidth"/>
-              <v:f eqn="sum @8 21600 0"/>
-              <v:f eqn="prod @7 21600 pixelHeight"/>
-              <v:f eqn="sum @10 21600 0"/>
-            </v:formulas>
-            <v:path o:extrusionok="f" gradientshapeok="t" o:connecttype="rect"/>
-            <o:lock v:ext="edit" aspectratio="t"/>
-          </v:shapetype>
-          <v:shape id="Picture 1152730722" o:spid="_x0000_i1025" type="#_x0000_t75" style="width:14.25pt;height:14.25pt;visibility:visible;mso-wrap-style:square">
-            <v:imagedata r:id="rId1" o:title=""/>
-          </v:shape>
-        </w:pict>
-      </mc:Choice>
-      <mc:Fallback>
-        <w:drawing>
-          <wp:inline distT="0" distB="0" distL="0" distR="0" wp14:anchorId="0F26B93B" wp14:editId="5B9CD809">
-            <wp:extent cx="180975" cy="180975"/>
-            <wp:effectExtent l="0" t="0" r="0" b="0"/>
-            <wp:docPr id="1152730722" name="Picture 1152730722"/>
-            <wp:cNvGraphicFramePr>
-              <a:graphicFrameLocks xmlns:a="http://schemas.openxmlformats.org/drawingml/2006/main" noChangeAspect="1"/>
-            </wp:cNvGraphicFramePr>
-            <a:graphic xmlns:a="http://schemas.openxmlformats.org/drawingml/2006/main">
-              <a:graphicData uri="http://schemas.openxmlformats.org/drawingml/2006/picture">
-                <pic:pic xmlns:pic="http://schemas.openxmlformats.org/drawingml/2006/picture">
-                  <pic:nvPicPr>
-                    <pic:cNvPr id="0" name="Picture -1023"/>
-                    <pic:cNvPicPr>
-                      <a:picLocks noChangeAspect="1" noChangeArrowheads="1"/>
-                    </pic:cNvPicPr>
-                  </pic:nvPicPr>
-                  <pic:blipFill>
-                    <a:blip r:embed="rId2">
-                      <a:extLst>
-                        <a:ext uri="{28A0092B-C50C-407E-A947-70E740481C1C}">
-                          <a14:useLocalDpi xmlns:a14="http://schemas.microsoft.com/office/drawing/2010/main" val="0"/>
-                        </a:ext>
-                      </a:extLst>
-                    </a:blip>
-                    <a:srcRect/>
-                    <a:stretch>
-                      <a:fillRect/>
-                    </a:stretch>
-                  </pic:blipFill>
-                  <pic:spPr bwMode="auto">
-                    <a:xfrm>
-                      <a:off x="0" y="0"/>
-                      <a:ext cx="180975" cy="180975"/>
-                    </a:xfrm>
-                    <a:prstGeom prst="rect">
-                      <a:avLst/>
-                    </a:prstGeom>
-                    <a:noFill/>
-                    <a:ln>
-                      <a:noFill/>
-                    </a:ln>
-                  </pic:spPr>
-                </pic:pic>
-              </a:graphicData>
-            </a:graphic>
-          </wp:inline>
-        </w:drawing>
-      </mc:Fallback>
-    </mc:AlternateContent>
+    <w:pict>
+      <v:shapetype id="_x0000_t75" coordsize="21600,21600" o:spt="75" o:preferrelative="t" path="m@4@5l@4@11@9@11@9@5xe" filled="f" stroked="f">
+        <v:stroke joinstyle="miter"/>
+        <v:formulas>
+          <v:f eqn="if lineDrawn pixelLineWidth 0"/>
+          <v:f eqn="sum @0 1 0"/>
+          <v:f eqn="sum 0 0 @1"/>
+          <v:f eqn="prod @2 1 2"/>
+          <v:f eqn="prod @3 21600 pixelWidth"/>
+          <v:f eqn="prod @3 21600 pixelHeight"/>
+          <v:f eqn="sum @0 0 1"/>
+          <v:f eqn="prod @6 1 2"/>
+          <v:f eqn="prod @7 21600 pixelWidth"/>
+          <v:f eqn="sum @8 21600 0"/>
+          <v:f eqn="prod @7 21600 pixelHeight"/>
+          <v:f eqn="sum @10 21600 0"/>
+        </v:formulas>
+        <v:path o:extrusionok="f" gradientshapeok="t" o:connecttype="rect"/>
+        <o:lock v:ext="edit" aspectratio="t"/>
+      </v:shapetype>
+      <v:shape id="_x0000_i1040" type="#_x0000_t75" style="width:14.25pt;height:14.25pt;visibility:visible;mso-wrap-style:square" o:bullet="t">
+        <v:imagedata r:id="rId1" o:title=""/>
+      </v:shape>
+    </w:pict>
   </w:numPicBullet>
   <w:numPicBullet w:numPicBulletId="1">
-    <mc:AlternateContent>
-      <mc:Choice Requires="v">
-        <w:pict>
-          <v:shape w14:anchorId="076BA072" id="Picture 1586411832" o:spid="_x0000_i1025" type="#_x0000_t75" style="width:14.25pt;height:14.25pt;visibility:visible;mso-wrap-style:square">
-            <v:imagedata r:id="rId3" o:title=""/>
-          </v:shape>
-        </w:pict>
-      </mc:Choice>
-      <mc:Fallback>
-        <w:drawing>
-          <wp:inline distT="0" distB="0" distL="0" distR="0" wp14:anchorId="2B18B5AD" wp14:editId="6DFE709B">
-            <wp:extent cx="180975" cy="180975"/>
-            <wp:effectExtent l="0" t="0" r="0" b="0"/>
-            <wp:docPr id="1586411832" name="Picture 1586411832"/>
-            <wp:cNvGraphicFramePr>
-              <a:graphicFrameLocks xmlns:a="http://schemas.openxmlformats.org/drawingml/2006/main" noChangeAspect="1"/>
-            </wp:cNvGraphicFramePr>
-            <a:graphic xmlns:a="http://schemas.openxmlformats.org/drawingml/2006/main">
-              <a:graphicData uri="http://schemas.openxmlformats.org/drawingml/2006/picture">
-                <pic:pic xmlns:pic="http://schemas.openxmlformats.org/drawingml/2006/picture">
-                  <pic:nvPicPr>
-                    <pic:cNvPr id="0" name="Picture -1022"/>
-                    <pic:cNvPicPr>
-                      <a:picLocks noChangeAspect="1" noChangeArrowheads="1"/>
-                    </pic:cNvPicPr>
-                  </pic:nvPicPr>
-                  <pic:blipFill>
-                    <a:blip r:embed="rId4">
-                      <a:extLst>
-                        <a:ext uri="{28A0092B-C50C-407E-A947-70E740481C1C}">
-                          <a14:useLocalDpi xmlns:a14="http://schemas.microsoft.com/office/drawing/2010/main" val="0"/>
-                        </a:ext>
-                      </a:extLst>
-                    </a:blip>
-                    <a:srcRect/>
-                    <a:stretch>
-                      <a:fillRect/>
-                    </a:stretch>
-                  </pic:blipFill>
-                  <pic:spPr bwMode="auto">
-                    <a:xfrm>
-                      <a:off x="0" y="0"/>
-                      <a:ext cx="180975" cy="180975"/>
-                    </a:xfrm>
-                    <a:prstGeom prst="rect">
-                      <a:avLst/>
-                    </a:prstGeom>
-                    <a:noFill/>
-                    <a:ln>
-                      <a:noFill/>
-                    </a:ln>
-                  </pic:spPr>
-                </pic:pic>
-              </a:graphicData>
-            </a:graphic>
-          </wp:inline>
-        </w:drawing>
-      </mc:Fallback>
-    </mc:AlternateContent>
+    <w:pict>
+      <v:shape id="_x0000_i1041" type="#_x0000_t75" style="width:14.25pt;height:14.25pt;visibility:visible;mso-wrap-style:square" o:bullet="t">
+        <v:imagedata r:id="rId2" o:title=""/>
+      </v:shape>
+    </w:pict>
   </w:numPicBullet>
   <w:abstractNum w:abstractNumId="0" w15:restartNumberingAfterBreak="0">
     <w:nsid w:val="02651E18"/>
@@ -3059,6 +2935,7 @@
   <w:style w:type="character" w:default="1" w:styleId="DefaultParagraphFont">
     <w:name w:val="Default Paragraph Font"/>
     <w:uiPriority w:val="1"/>
+    <w:semiHidden/>
     <w:unhideWhenUsed/>
   </w:style>
   <w:style w:type="table" w:default="1" w:styleId="TableNormal">
@@ -3761,6 +3638,19 @@
 </file>
 
 <file path=customXml/item1.xml><?xml version="1.0" encoding="utf-8"?>
+<?mso-contentType ?>
+<FormTemplates xmlns="http://schemas.microsoft.com/sharepoint/v3/contenttype/forms">
+  <Display>DocumentLibraryForm</Display>
+  <Edit>DocumentLibraryForm</Edit>
+  <New>DocumentLibraryForm</New>
+</FormTemplates>
+</file>
+
+<file path=customXml/item2.xml><?xml version="1.0" encoding="utf-8"?>
+<b:Sources xmlns:b="http://schemas.openxmlformats.org/officeDocument/2006/bibliography" xmlns="http://schemas.openxmlformats.org/officeDocument/2006/bibliography" SelectedStyle="/APASixthEditionOfficeOnline.xsl" StyleName="APA" Version="6"/>
+</file>
+
+<file path=customXml/item3.xml><?xml version="1.0" encoding="utf-8"?>
 <p:properties xmlns:p="http://schemas.microsoft.com/office/2006/metadata/properties" xmlns:xsi="http://www.w3.org/2001/XMLSchema-instance" xmlns:pc="http://schemas.microsoft.com/office/infopath/2007/PartnerControls">
   <documentManagement>
     <_ip_UnifiedCompliancePolicyUIAction xmlns="http://schemas.microsoft.com/sharepoint/v3" xsi:nil="true"/>
@@ -3778,19 +3668,6 @@
     <MediaServiceKeyPoints xmlns="71af3243-3dd4-4a8d-8c0d-dd76da1f02a5" xsi:nil="true"/>
   </documentManagement>
 </p:properties>
-</file>
-
-<file path=customXml/item2.xml><?xml version="1.0" encoding="utf-8"?>
-<b:Sources xmlns:b="http://schemas.openxmlformats.org/officeDocument/2006/bibliography" xmlns="http://schemas.openxmlformats.org/officeDocument/2006/bibliography" SelectedStyle="/APASixthEditionOfficeOnline.xsl" StyleName="APA" Version="6"/>
-</file>
-
-<file path=customXml/item3.xml><?xml version="1.0" encoding="utf-8"?>
-<?mso-contentType ?>
-<FormTemplates xmlns="http://schemas.microsoft.com/sharepoint/v3/contenttype/forms">
-  <Display>DocumentLibraryForm</Display>
-  <Edit>DocumentLibraryForm</Edit>
-  <New>DocumentLibraryForm</New>
-</FormTemplates>
 </file>
 
 <file path=customXml/item4.xml><?xml version="1.0" encoding="utf-8"?>
@@ -4106,13 +3983,9 @@
 </file>
 
 <file path=customXml/itemProps1.xml><?xml version="1.0" encoding="utf-8"?>
-<ds:datastoreItem xmlns:ds="http://schemas.openxmlformats.org/officeDocument/2006/customXml" ds:itemID="{976E9C11-7EA5-477D-9B95-C6785A9AA812}">
+<ds:datastoreItem xmlns:ds="http://schemas.openxmlformats.org/officeDocument/2006/customXml" ds:itemID="{59C0D372-28D0-4A7F-8DC2-036EF5C56217}">
   <ds:schemaRefs>
-    <ds:schemaRef ds:uri="http://schemas.microsoft.com/office/2006/metadata/properties"/>
-    <ds:schemaRef ds:uri="http://schemas.microsoft.com/office/infopath/2007/PartnerControls"/>
-    <ds:schemaRef ds:uri="http://schemas.microsoft.com/sharepoint/v3"/>
-    <ds:schemaRef ds:uri="71af3243-3dd4-4a8d-8c0d-dd76da1f02a5"/>
-    <ds:schemaRef ds:uri="230e9df3-be65-4c73-a93b-d1236ebd677e"/>
+    <ds:schemaRef ds:uri="http://schemas.microsoft.com/sharepoint/v3/contenttype/forms"/>
   </ds:schemaRefs>
 </ds:datastoreItem>
 </file>
@@ -4126,9 +3999,13 @@
 </file>
 
 <file path=customXml/itemProps3.xml><?xml version="1.0" encoding="utf-8"?>
-<ds:datastoreItem xmlns:ds="http://schemas.openxmlformats.org/officeDocument/2006/customXml" ds:itemID="{59C0D372-28D0-4A7F-8DC2-036EF5C56217}">
+<ds:datastoreItem xmlns:ds="http://schemas.openxmlformats.org/officeDocument/2006/customXml" ds:itemID="{976E9C11-7EA5-477D-9B95-C6785A9AA812}">
   <ds:schemaRefs>
-    <ds:schemaRef ds:uri="http://schemas.microsoft.com/sharepoint/v3/contenttype/forms"/>
+    <ds:schemaRef ds:uri="http://schemas.microsoft.com/office/2006/metadata/properties"/>
+    <ds:schemaRef ds:uri="http://schemas.microsoft.com/office/infopath/2007/PartnerControls"/>
+    <ds:schemaRef ds:uri="http://schemas.microsoft.com/sharepoint/v3"/>
+    <ds:schemaRef ds:uri="71af3243-3dd4-4a8d-8c0d-dd76da1f02a5"/>
+    <ds:schemaRef ds:uri="230e9df3-be65-4c73-a93b-d1236ebd677e"/>
   </ds:schemaRefs>
 </ds:datastoreItem>
 </file>

</xml_diff>